<commit_message>
ch1 intro progress, started study system
</commit_message>
<xml_diff>
--- a/documents/thesis manuscript/manuscript_260318.docx
+++ b/documents/thesis manuscript/manuscript_260318.docx
@@ -675,7 +675,31 @@
         <w:rPr>
           <w:rFonts w:ascii="Times New Roman" w:hAnsi="Times New Roman" w:cs="Times New Roman"/>
         </w:rPr>
-        <w:t xml:space="preserve"> responses among individuals, meaning acclimation to a new climate state is not possible. </w:t>
+        <w:t xml:space="preserve"> responses among individuals, meaning acclimation to a new climate state </w:t>
+      </w:r>
+      <w:r>
+        <w:rPr>
+          <w:rFonts w:ascii="Times New Roman" w:hAnsi="Times New Roman" w:cs="Times New Roman"/>
+        </w:rPr>
+        <w:t>may</w:t>
+      </w:r>
+      <w:r>
+        <w:rPr>
+          <w:rFonts w:ascii="Times New Roman" w:hAnsi="Times New Roman" w:cs="Times New Roman"/>
+        </w:rPr>
+        <w:t xml:space="preserve"> not </w:t>
+      </w:r>
+      <w:r>
+        <w:rPr>
+          <w:rFonts w:ascii="Times New Roman" w:hAnsi="Times New Roman" w:cs="Times New Roman"/>
+        </w:rPr>
+        <w:t xml:space="preserve">be </w:t>
+      </w:r>
+      <w:r>
+        <w:rPr>
+          <w:rFonts w:ascii="Times New Roman" w:hAnsi="Times New Roman" w:cs="Times New Roman"/>
+        </w:rPr>
+        <w:t xml:space="preserve">possible. </w:t>
       </w:r>
       <w:r>
         <w:rPr>
@@ -1344,6 +1368,560 @@
           <w:rFonts w:ascii="Times New Roman" w:hAnsi="Times New Roman" w:cs="Times New Roman"/>
         </w:rPr>
         <w:t xml:space="preserve"> </w:t>
+      </w:r>
+    </w:p>
+    <w:p>
+      <w:pPr>
+        <w:spacing w:after="0" w:line="240" w:lineRule="auto"/>
+        <w:rPr>
+          <w:rFonts w:ascii="Times New Roman" w:hAnsi="Times New Roman" w:cs="Times New Roman"/>
+        </w:rPr>
+      </w:pPr>
+    </w:p>
+    <w:p>
+      <w:pPr>
+        <w:spacing w:after="0" w:line="240" w:lineRule="auto"/>
+        <w:rPr>
+          <w:rFonts w:ascii="Times New Roman" w:hAnsi="Times New Roman" w:cs="Times New Roman"/>
+        </w:rPr>
+      </w:pPr>
+      <w:r>
+        <w:rPr>
+          <w:rFonts w:ascii="Times New Roman" w:hAnsi="Times New Roman" w:cs="Times New Roman"/>
+        </w:rPr>
+        <w:lastRenderedPageBreak/>
+        <w:t xml:space="preserve">One such spatially hierarchical system is the water-filled leaves of the carnivorous Purple Pitcher Plant, </w:t>
+      </w:r>
+      <w:r>
+        <w:rPr>
+          <w:rFonts w:ascii="Times New Roman" w:hAnsi="Times New Roman" w:cs="Times New Roman"/>
+          <w:i/>
+          <w:iCs/>
+        </w:rPr>
+        <w:t>Sarracenia purpurea</w:t>
+      </w:r>
+      <w:r>
+        <w:rPr>
+          <w:rFonts w:ascii="Times New Roman" w:hAnsi="Times New Roman" w:cs="Times New Roman"/>
+        </w:rPr>
+        <w:t xml:space="preserve">. This </w:t>
+      </w:r>
+      <w:proofErr w:type="spellStart"/>
+      <w:r>
+        <w:rPr>
+          <w:rFonts w:ascii="Times New Roman" w:hAnsi="Times New Roman" w:cs="Times New Roman"/>
+        </w:rPr>
+        <w:t>phytotelmic</w:t>
+      </w:r>
+      <w:proofErr w:type="spellEnd"/>
+      <w:r>
+        <w:rPr>
+          <w:rFonts w:ascii="Times New Roman" w:hAnsi="Times New Roman" w:cs="Times New Roman"/>
+        </w:rPr>
+        <w:t xml:space="preserve"> habitat is home to many species of specialist inquilines spanning multiple trophic levels.</w:t>
+      </w:r>
+      <w:r>
+        <w:rPr>
+          <w:rFonts w:ascii="Times New Roman" w:hAnsi="Times New Roman" w:cs="Times New Roman"/>
+        </w:rPr>
+        <w:t xml:space="preserve"> As each new leaf opens, </w:t>
+      </w:r>
+      <w:r>
+        <w:rPr>
+          <w:rFonts w:ascii="Times New Roman" w:hAnsi="Times New Roman" w:cs="Times New Roman"/>
+        </w:rPr>
+        <w:t>microbial decomposers including bacteria and single-celled yeasts break down and consume prey (mostly ants and other small insects) and organic debris. M</w:t>
+      </w:r>
+      <w:r>
+        <w:rPr>
+          <w:rFonts w:ascii="Times New Roman" w:hAnsi="Times New Roman" w:cs="Times New Roman"/>
+        </w:rPr>
+        <w:t xml:space="preserve">ore than a dozen species of ciliates, flagellates, amoebae, and rotifers </w:t>
+      </w:r>
+      <w:r>
+        <w:rPr>
+          <w:rFonts w:ascii="Times New Roman" w:hAnsi="Times New Roman" w:cs="Times New Roman"/>
+        </w:rPr>
+        <w:t xml:space="preserve">arrive to graze on </w:t>
+      </w:r>
+      <w:r>
+        <w:rPr>
+          <w:rFonts w:ascii="Times New Roman" w:hAnsi="Times New Roman" w:cs="Times New Roman"/>
+        </w:rPr>
+        <w:t>the primary consumers. These meso-consumers are in turn predated by the larvae of mosquitos (</w:t>
+      </w:r>
+      <w:r>
+        <w:rPr>
+          <w:rFonts w:ascii="Times New Roman" w:hAnsi="Times New Roman" w:cs="Times New Roman"/>
+          <w:i/>
+          <w:iCs/>
+        </w:rPr>
+        <w:t xml:space="preserve">Wyeomyia </w:t>
+      </w:r>
+      <w:r>
+        <w:rPr>
+          <w:rFonts w:ascii="Times New Roman" w:hAnsi="Times New Roman" w:cs="Times New Roman"/>
+          <w:i/>
+          <w:iCs/>
+        </w:rPr>
+        <w:t>smithii</w:t>
+      </w:r>
+      <w:r>
+        <w:rPr>
+          <w:rFonts w:ascii="Times New Roman" w:hAnsi="Times New Roman" w:cs="Times New Roman"/>
+        </w:rPr>
+        <w:t xml:space="preserve">) </w:t>
+      </w:r>
+      <w:r>
+        <w:rPr>
+          <w:rFonts w:ascii="Times New Roman" w:hAnsi="Times New Roman" w:cs="Times New Roman"/>
+        </w:rPr>
+        <w:t>and</w:t>
+      </w:r>
+      <w:r>
+        <w:rPr>
+          <w:rFonts w:ascii="Times New Roman" w:hAnsi="Times New Roman" w:cs="Times New Roman"/>
+        </w:rPr>
+        <w:t xml:space="preserve"> sometimes </w:t>
+      </w:r>
+      <w:proofErr w:type="spellStart"/>
+      <w:r>
+        <w:rPr>
+          <w:rFonts w:ascii="Times New Roman" w:hAnsi="Times New Roman" w:cs="Times New Roman"/>
+        </w:rPr>
+        <w:t>sarcophagid</w:t>
+      </w:r>
+      <w:proofErr w:type="spellEnd"/>
+      <w:r>
+        <w:rPr>
+          <w:rFonts w:ascii="Times New Roman" w:hAnsi="Times New Roman" w:cs="Times New Roman"/>
+        </w:rPr>
+        <w:t xml:space="preserve"> flies (</w:t>
+      </w:r>
+      <w:proofErr w:type="spellStart"/>
+      <w:r>
+        <w:rPr>
+          <w:rFonts w:ascii="Times New Roman" w:hAnsi="Times New Roman" w:cs="Times New Roman"/>
+          <w:i/>
+          <w:iCs/>
+        </w:rPr>
+        <w:t>Fletcherimyia</w:t>
+      </w:r>
+      <w:proofErr w:type="spellEnd"/>
+      <w:r>
+        <w:rPr>
+          <w:rFonts w:ascii="Times New Roman" w:hAnsi="Times New Roman" w:cs="Times New Roman"/>
+          <w:i/>
+          <w:iCs/>
+        </w:rPr>
+        <w:t xml:space="preserve"> </w:t>
+      </w:r>
+      <w:proofErr w:type="spellStart"/>
+      <w:r>
+        <w:rPr>
+          <w:rFonts w:ascii="Times New Roman" w:hAnsi="Times New Roman" w:cs="Times New Roman"/>
+          <w:i/>
+          <w:iCs/>
+        </w:rPr>
+        <w:t>fletcheri</w:t>
+      </w:r>
+      <w:proofErr w:type="spellEnd"/>
+      <w:r>
+        <w:rPr>
+          <w:rFonts w:ascii="Times New Roman" w:hAnsi="Times New Roman" w:cs="Times New Roman"/>
+        </w:rPr>
+        <w:t>).</w:t>
+      </w:r>
+      <w:r>
+        <w:rPr>
+          <w:rFonts w:ascii="Times New Roman" w:hAnsi="Times New Roman" w:cs="Times New Roman"/>
+        </w:rPr>
+        <w:t xml:space="preserve"> The successional dynamics of this community are well documented</w:t>
+      </w:r>
+      <w:r>
+        <w:rPr>
+          <w:rFonts w:ascii="Times New Roman" w:hAnsi="Times New Roman" w:cs="Times New Roman"/>
+        </w:rPr>
+        <w:t xml:space="preserve">, but the </w:t>
+      </w:r>
+      <w:r>
+        <w:rPr>
+          <w:rFonts w:ascii="Times New Roman" w:hAnsi="Times New Roman" w:cs="Times New Roman"/>
+        </w:rPr>
+        <w:t>standing genetic variation</w:t>
+      </w:r>
+      <w:r>
+        <w:rPr>
+          <w:rFonts w:ascii="Times New Roman" w:hAnsi="Times New Roman" w:cs="Times New Roman"/>
+        </w:rPr>
+        <w:t xml:space="preserve"> of its members is less understood. </w:t>
+      </w:r>
+      <w:r>
+        <w:rPr>
+          <w:rFonts w:ascii="Times New Roman" w:hAnsi="Times New Roman" w:cs="Times New Roman"/>
+        </w:rPr>
+        <w:t xml:space="preserve">Recent work has shown </w:t>
+      </w:r>
+      <w:r>
+        <w:rPr>
+          <w:rFonts w:ascii="Times New Roman" w:hAnsi="Times New Roman" w:cs="Times New Roman"/>
+        </w:rPr>
+        <w:t xml:space="preserve">that </w:t>
+      </w:r>
+      <w:r>
+        <w:rPr>
+          <w:rFonts w:ascii="Times New Roman" w:hAnsi="Times New Roman" w:cs="Times New Roman"/>
+        </w:rPr>
+        <w:t>bacterial communities are strongly spatially structured across pitchers, with community assembly varying more among locations than expected from environmental differences alone</w:t>
+      </w:r>
+      <w:r>
+        <w:rPr>
+          <w:rFonts w:ascii="Times New Roman" w:hAnsi="Times New Roman" w:cs="Times New Roman"/>
+        </w:rPr>
+        <w:t xml:space="preserve">. </w:t>
+      </w:r>
+      <w:r>
+        <w:rPr>
+          <w:rFonts w:ascii="Times New Roman" w:hAnsi="Times New Roman" w:cs="Times New Roman"/>
+        </w:rPr>
+        <w:t xml:space="preserve">However, </w:t>
+      </w:r>
+      <w:r>
+        <w:rPr>
+          <w:rFonts w:ascii="Times New Roman" w:hAnsi="Times New Roman" w:cs="Times New Roman"/>
+        </w:rPr>
+        <w:t xml:space="preserve">whether similar spatial structuring occurs at higher trophic levels is unknown. As a result, </w:t>
+      </w:r>
+      <w:r>
+        <w:rPr>
+          <w:rFonts w:ascii="Times New Roman" w:hAnsi="Times New Roman" w:cs="Times New Roman"/>
+        </w:rPr>
+        <w:t xml:space="preserve">the </w:t>
+      </w:r>
+      <w:r>
+        <w:rPr>
+          <w:rFonts w:ascii="Times New Roman" w:hAnsi="Times New Roman" w:cs="Times New Roman"/>
+        </w:rPr>
+        <w:t>extent to which standing genetic variation is partitioned across space</w:t>
+      </w:r>
+      <w:r>
+        <w:rPr>
+          <w:rFonts w:ascii="Times New Roman" w:hAnsi="Times New Roman" w:cs="Times New Roman"/>
+        </w:rPr>
+        <w:t xml:space="preserve">, particularly </w:t>
+      </w:r>
+      <w:r>
+        <w:rPr>
+          <w:rFonts w:ascii="Times New Roman" w:hAnsi="Times New Roman" w:cs="Times New Roman"/>
+        </w:rPr>
+        <w:t xml:space="preserve">for populations of </w:t>
+      </w:r>
+      <w:r>
+        <w:rPr>
+          <w:rFonts w:ascii="Times New Roman" w:hAnsi="Times New Roman" w:cs="Times New Roman"/>
+        </w:rPr>
+        <w:t>meso-consumers, remain</w:t>
+      </w:r>
+      <w:r>
+        <w:rPr>
+          <w:rFonts w:ascii="Times New Roman" w:hAnsi="Times New Roman" w:cs="Times New Roman"/>
+        </w:rPr>
+        <w:t>s</w:t>
+      </w:r>
+      <w:r>
+        <w:rPr>
+          <w:rFonts w:ascii="Times New Roman" w:hAnsi="Times New Roman" w:cs="Times New Roman"/>
+        </w:rPr>
+        <w:t xml:space="preserve"> largely unexplored. </w:t>
+      </w:r>
+    </w:p>
+    <w:p>
+      <w:pPr>
+        <w:spacing w:after="0" w:line="240" w:lineRule="auto"/>
+        <w:rPr>
+          <w:rFonts w:ascii="Times New Roman" w:hAnsi="Times New Roman" w:cs="Times New Roman"/>
+        </w:rPr>
+      </w:pPr>
+    </w:p>
+    <w:p>
+      <w:pPr>
+        <w:spacing w:after="0" w:line="240" w:lineRule="auto"/>
+        <w:rPr>
+          <w:rFonts w:ascii="Times New Roman" w:hAnsi="Times New Roman" w:cs="Times New Roman"/>
+        </w:rPr>
+      </w:pPr>
+      <w:r>
+        <w:rPr>
+          <w:rFonts w:ascii="Times New Roman" w:hAnsi="Times New Roman" w:cs="Times New Roman"/>
+        </w:rPr>
+        <w:t xml:space="preserve">In a laboratory experiment using microcosms that mimic the conditions of natural </w:t>
+      </w:r>
+      <w:r>
+        <w:rPr>
+          <w:rFonts w:ascii="Times New Roman" w:hAnsi="Times New Roman" w:cs="Times New Roman"/>
+          <w:i/>
+          <w:iCs/>
+        </w:rPr>
+        <w:t>S. purpurea</w:t>
+      </w:r>
+      <w:r>
+        <w:rPr>
+          <w:rFonts w:ascii="Times New Roman" w:hAnsi="Times New Roman" w:cs="Times New Roman"/>
+        </w:rPr>
+        <w:t xml:space="preserve"> leaves, I investigated the spatial distribution of standing genetic variation in response to temperature among clones of Pitcher Plant Rotifers (</w:t>
+      </w:r>
+      <w:r>
+        <w:rPr>
+          <w:rFonts w:ascii="Times New Roman" w:hAnsi="Times New Roman" w:cs="Times New Roman"/>
+          <w:i/>
+          <w:iCs/>
+        </w:rPr>
+        <w:t>Habrotrocha rosa</w:t>
+      </w:r>
+      <w:r>
+        <w:rPr>
+          <w:rFonts w:ascii="Times New Roman" w:hAnsi="Times New Roman" w:cs="Times New Roman"/>
+        </w:rPr>
+        <w:t>)</w:t>
+      </w:r>
+      <w:r>
+        <w:rPr>
+          <w:rFonts w:ascii="Times New Roman" w:hAnsi="Times New Roman" w:cs="Times New Roman"/>
+        </w:rPr>
+        <w:t xml:space="preserve">. </w:t>
+      </w:r>
+      <w:r>
+        <w:rPr>
+          <w:rFonts w:ascii="Times New Roman" w:hAnsi="Times New Roman" w:cs="Times New Roman"/>
+          <w:i/>
+          <w:iCs/>
+        </w:rPr>
+        <w:t>Habrotrocha rosa</w:t>
+      </w:r>
+      <w:r>
+        <w:rPr>
+          <w:rFonts w:ascii="Times New Roman" w:hAnsi="Times New Roman" w:cs="Times New Roman"/>
+        </w:rPr>
+        <w:t xml:space="preserve"> was</w:t>
+      </w:r>
+      <w:r>
+        <w:rPr>
+          <w:rFonts w:ascii="Times New Roman" w:hAnsi="Times New Roman" w:cs="Times New Roman"/>
+        </w:rPr>
+        <w:t xml:space="preserve"> collected from different leaves at two sites in the Apalachicola National Forest</w:t>
+      </w:r>
+      <w:r>
+        <w:rPr>
+          <w:rFonts w:ascii="Times New Roman" w:hAnsi="Times New Roman" w:cs="Times New Roman"/>
+        </w:rPr>
+        <w:t xml:space="preserve"> </w:t>
+      </w:r>
+      <w:r>
+        <w:rPr>
+          <w:rFonts w:ascii="Times New Roman" w:hAnsi="Times New Roman" w:cs="Times New Roman"/>
+        </w:rPr>
+        <w:t xml:space="preserve">in Florida </w:t>
+      </w:r>
+      <w:r>
+        <w:rPr>
+          <w:rFonts w:ascii="Times New Roman" w:hAnsi="Times New Roman" w:cs="Times New Roman"/>
+        </w:rPr>
+        <w:t xml:space="preserve">along the southern range of </w:t>
+      </w:r>
+      <w:r>
+        <w:rPr>
+          <w:rFonts w:ascii="Times New Roman" w:hAnsi="Times New Roman" w:cs="Times New Roman"/>
+          <w:i/>
+          <w:iCs/>
+        </w:rPr>
+        <w:t>S. purpurea</w:t>
+      </w:r>
+      <w:r>
+        <w:rPr>
+          <w:rFonts w:ascii="Times New Roman" w:hAnsi="Times New Roman" w:cs="Times New Roman"/>
+        </w:rPr>
+        <w:t xml:space="preserve">. </w:t>
+      </w:r>
+      <w:r>
+        <w:rPr>
+          <w:rFonts w:ascii="Times New Roman" w:hAnsi="Times New Roman" w:cs="Times New Roman"/>
+        </w:rPr>
+        <w:t xml:space="preserve">Apalachicola National Forest is expected to experience 2–4 °C increase in average daytime temperatures, shifting from 25 </w:t>
+      </w:r>
+      <w:r>
+        <w:rPr>
+          <w:rFonts w:ascii="Times New Roman" w:hAnsi="Times New Roman" w:cs="Times New Roman"/>
+        </w:rPr>
+        <w:t>°C</w:t>
+      </w:r>
+      <w:r>
+        <w:rPr>
+          <w:rFonts w:ascii="Times New Roman" w:hAnsi="Times New Roman" w:cs="Times New Roman"/>
+        </w:rPr>
+        <w:t xml:space="preserve"> to 30 </w:t>
+      </w:r>
+      <w:r>
+        <w:rPr>
+          <w:rFonts w:ascii="Times New Roman" w:hAnsi="Times New Roman" w:cs="Times New Roman"/>
+        </w:rPr>
+        <w:t>°C</w:t>
+      </w:r>
+      <w:r>
+        <w:rPr>
+          <w:rFonts w:ascii="Times New Roman" w:hAnsi="Times New Roman" w:cs="Times New Roman"/>
+        </w:rPr>
+        <w:t>, by the year 2100</w:t>
+      </w:r>
+      <w:r>
+        <w:rPr>
+          <w:rFonts w:ascii="Times New Roman" w:hAnsi="Times New Roman" w:cs="Times New Roman"/>
+        </w:rPr>
+        <w:t xml:space="preserve"> (</w:t>
+      </w:r>
+      <w:r>
+        <w:rPr>
+          <w:rFonts w:ascii="Times New Roman" w:hAnsi="Times New Roman" w:cs="Times New Roman"/>
+          <w:highlight w:val="cyan"/>
+        </w:rPr>
+        <w:t>CITE</w:t>
+      </w:r>
+      <w:r>
+        <w:rPr>
+          <w:rFonts w:ascii="Times New Roman" w:hAnsi="Times New Roman" w:cs="Times New Roman"/>
+        </w:rPr>
+        <w:t>)</w:t>
+      </w:r>
+      <w:r>
+        <w:rPr>
+          <w:rFonts w:ascii="Times New Roman" w:hAnsi="Times New Roman" w:cs="Times New Roman"/>
+        </w:rPr>
+        <w:t>.</w:t>
+      </w:r>
+      <w:r>
+        <w:rPr>
+          <w:rFonts w:ascii="Times New Roman" w:hAnsi="Times New Roman" w:cs="Times New Roman"/>
+        </w:rPr>
+        <w:t xml:space="preserve"> </w:t>
+      </w:r>
+      <w:r>
+        <w:rPr>
+          <w:rFonts w:ascii="Times New Roman" w:hAnsi="Times New Roman" w:cs="Times New Roman"/>
+        </w:rPr>
+        <w:t xml:space="preserve">Populations of </w:t>
+      </w:r>
+      <w:r>
+        <w:rPr>
+          <w:rFonts w:ascii="Times New Roman" w:hAnsi="Times New Roman" w:cs="Times New Roman"/>
+          <w:i/>
+          <w:iCs/>
+        </w:rPr>
+        <w:t xml:space="preserve">S. </w:t>
+      </w:r>
+      <w:r>
+        <w:rPr>
+          <w:rFonts w:ascii="Times New Roman" w:hAnsi="Times New Roman" w:cs="Times New Roman"/>
+          <w:i/>
+          <w:iCs/>
+        </w:rPr>
+        <w:t>purpurea</w:t>
+      </w:r>
+      <w:r>
+        <w:rPr>
+          <w:rFonts w:ascii="Times New Roman" w:hAnsi="Times New Roman" w:cs="Times New Roman"/>
+        </w:rPr>
+        <w:t xml:space="preserve"> </w:t>
+      </w:r>
+      <w:r>
+        <w:rPr>
+          <w:rFonts w:ascii="Times New Roman" w:hAnsi="Times New Roman" w:cs="Times New Roman"/>
+        </w:rPr>
+        <w:t>along this southern edge of its range are particularly vulnerable to extirpation</w:t>
+      </w:r>
+      <w:r>
+        <w:rPr>
+          <w:rFonts w:ascii="Times New Roman" w:hAnsi="Times New Roman" w:cs="Times New Roman"/>
+        </w:rPr>
+        <w:t xml:space="preserve"> (NatureServe 2025)</w:t>
+      </w:r>
+      <w:r>
+        <w:rPr>
+          <w:rFonts w:ascii="Times New Roman" w:hAnsi="Times New Roman" w:cs="Times New Roman"/>
+        </w:rPr>
+        <w:t>, not only through direct human activity (</w:t>
+      </w:r>
+      <w:r>
+        <w:rPr>
+          <w:rFonts w:ascii="Times New Roman" w:hAnsi="Times New Roman" w:cs="Times New Roman"/>
+        </w:rPr>
+        <w:t>Gotelli and Ellison, 2002</w:t>
+      </w:r>
+      <w:r>
+        <w:rPr>
+          <w:rFonts w:ascii="Times New Roman" w:hAnsi="Times New Roman" w:cs="Times New Roman"/>
+        </w:rPr>
+        <w:t xml:space="preserve">) but also </w:t>
+      </w:r>
+      <w:r>
+        <w:rPr>
+          <w:rFonts w:ascii="Times New Roman" w:hAnsi="Times New Roman" w:cs="Times New Roman"/>
+        </w:rPr>
+        <w:t>due to</w:t>
+      </w:r>
+      <w:r>
+        <w:rPr>
+          <w:rFonts w:ascii="Times New Roman" w:hAnsi="Times New Roman" w:cs="Times New Roman"/>
+        </w:rPr>
+        <w:t xml:space="preserve"> climate-driven disturbances (Abbott and Battaglia, 2015; Brown et al, 2025)</w:t>
+      </w:r>
+      <w:r>
+        <w:rPr>
+          <w:rFonts w:ascii="Times New Roman" w:hAnsi="Times New Roman" w:cs="Times New Roman"/>
+        </w:rPr>
+        <w:t xml:space="preserve">. </w:t>
+      </w:r>
+      <w:r>
+        <w:rPr>
+          <w:rFonts w:ascii="Times New Roman" w:hAnsi="Times New Roman" w:cs="Times New Roman"/>
+        </w:rPr>
+        <w:t>Very</w:t>
+      </w:r>
+      <w:r>
+        <w:rPr>
+          <w:rFonts w:ascii="Times New Roman" w:hAnsi="Times New Roman" w:cs="Times New Roman"/>
+        </w:rPr>
+        <w:t xml:space="preserve"> few studies have explored the effects of climate change on </w:t>
+      </w:r>
+      <w:r>
+        <w:rPr>
+          <w:rFonts w:ascii="Times New Roman" w:hAnsi="Times New Roman" w:cs="Times New Roman"/>
+          <w:i/>
+          <w:iCs/>
+        </w:rPr>
+        <w:t>S. purpurea</w:t>
+      </w:r>
+      <w:r>
+        <w:rPr>
+          <w:rFonts w:ascii="Times New Roman" w:hAnsi="Times New Roman" w:cs="Times New Roman"/>
+        </w:rPr>
+        <w:t xml:space="preserve"> inquiline communities, and </w:t>
+      </w:r>
+      <w:r>
+        <w:rPr>
+          <w:rFonts w:ascii="Times New Roman" w:hAnsi="Times New Roman" w:cs="Times New Roman"/>
+        </w:rPr>
+        <w:t xml:space="preserve">of </w:t>
+      </w:r>
+      <w:r>
+        <w:rPr>
+          <w:rFonts w:ascii="Times New Roman" w:hAnsi="Times New Roman" w:cs="Times New Roman"/>
+        </w:rPr>
+        <w:t>those that have</w:t>
+      </w:r>
+      <w:r>
+        <w:rPr>
+          <w:rFonts w:ascii="Times New Roman" w:hAnsi="Times New Roman" w:cs="Times New Roman"/>
+        </w:rPr>
+        <w:t xml:space="preserve">, </w:t>
       </w:r>
     </w:p>
     <w:p>
@@ -1370,8 +1948,16 @@
         <w:rPr>
           <w:rFonts w:ascii="Times New Roman" w:hAnsi="Times New Roman" w:cs="Times New Roman"/>
         </w:rPr>
-        <w:t>Most studies partition variance as trait values</w:t>
-      </w:r>
+        <w:t xml:space="preserve">Temp change in </w:t>
+      </w:r>
+      <w:proofErr w:type="spellStart"/>
+      <w:r>
+        <w:rPr>
+          <w:rFonts w:ascii="Times New Roman" w:hAnsi="Times New Roman" w:cs="Times New Roman"/>
+        </w:rPr>
+        <w:t>fl</w:t>
+      </w:r>
+      <w:proofErr w:type="spellEnd"/>
     </w:p>
     <w:p>
       <w:pPr>
@@ -1389,8 +1975,343 @@
         <w:rPr>
           <w:rFonts w:ascii="Times New Roman" w:hAnsi="Times New Roman" w:cs="Times New Roman"/>
         </w:rPr>
+        <w:t>Importance of hr</w:t>
+      </w:r>
+    </w:p>
+    <w:p>
+      <w:pPr>
+        <w:pStyle w:val="ListParagraph"/>
+        <w:spacing w:after="0" w:line="240" w:lineRule="auto"/>
+        <w:rPr>
+          <w:rFonts w:ascii="Times New Roman" w:hAnsi="Times New Roman" w:cs="Times New Roman"/>
+        </w:rPr>
+      </w:pPr>
+    </w:p>
+    <w:p>
+      <w:pPr>
+        <w:spacing w:after="0" w:line="240" w:lineRule="auto"/>
+        <w:rPr>
+          <w:rFonts w:ascii="Times New Roman" w:hAnsi="Times New Roman" w:cs="Times New Roman"/>
+        </w:rPr>
+      </w:pPr>
+    </w:p>
+    <w:p>
+      <w:pPr>
+        <w:spacing w:after="0" w:line="240" w:lineRule="auto"/>
+        <w:rPr>
+          <w:rFonts w:ascii="Times New Roman" w:hAnsi="Times New Roman" w:cs="Times New Roman"/>
+        </w:rPr>
+      </w:pPr>
+    </w:p>
+    <w:p>
+      <w:pPr>
+        <w:spacing w:after="0" w:line="240" w:lineRule="auto"/>
+        <w:rPr>
+          <w:rFonts w:ascii="Times New Roman" w:hAnsi="Times New Roman" w:cs="Times New Roman"/>
+        </w:rPr>
+      </w:pPr>
+    </w:p>
+    <w:p>
+      <w:pPr>
+        <w:spacing w:after="0" w:line="240" w:lineRule="auto"/>
+        <w:rPr>
+          <w:rFonts w:ascii="Times New Roman" w:hAnsi="Times New Roman" w:cs="Times New Roman"/>
+        </w:rPr>
+      </w:pPr>
+    </w:p>
+    <w:p>
+      <w:pPr>
+        <w:spacing w:after="0" w:line="480" w:lineRule="auto"/>
+        <w:rPr>
+          <w:rFonts w:ascii="Times New Roman" w:hAnsi="Times New Roman" w:cs="Times New Roman"/>
+        </w:rPr>
+      </w:pPr>
+    </w:p>
+    <w:p>
+      <w:pPr>
+        <w:rPr>
+          <w:rFonts w:ascii="Times New Roman" w:hAnsi="Times New Roman" w:cs="Times New Roman"/>
+        </w:rPr>
+      </w:pPr>
+      <w:r>
+        <w:rPr>
+          <w:rFonts w:ascii="Times New Roman" w:hAnsi="Times New Roman" w:cs="Times New Roman"/>
+        </w:rPr>
+        <w:br w:type="page"/>
+      </w:r>
+    </w:p>
+    <w:p>
+      <w:pPr>
+        <w:spacing w:after="0" w:line="480" w:lineRule="auto"/>
+        <w:rPr>
+          <w:rFonts w:ascii="Times New Roman" w:hAnsi="Times New Roman" w:cs="Times New Roman"/>
+        </w:rPr>
+      </w:pPr>
+      <w:r>
+        <w:rPr>
+          <w:rFonts w:ascii="Times New Roman" w:hAnsi="Times New Roman" w:cs="Times New Roman"/>
+        </w:rPr>
         <w:lastRenderedPageBreak/>
-        <w:t>Misses the potential for response to environment to have the relevant variation</w:t>
+        <w:t>Readings</w:t>
+      </w:r>
+      <w:r>
+        <w:rPr>
+          <w:rFonts w:ascii="Times New Roman" w:hAnsi="Times New Roman" w:cs="Times New Roman"/>
+        </w:rPr>
+        <w:t>:</w:t>
+      </w:r>
+    </w:p>
+    <w:p>
+      <w:pPr>
+        <w:spacing w:after="0" w:line="240" w:lineRule="auto"/>
+        <w:rPr>
+          <w:rFonts w:ascii="Times New Roman" w:hAnsi="Times New Roman" w:cs="Times New Roman"/>
+        </w:rPr>
+      </w:pPr>
+      <w:r>
+        <w:rPr>
+          <w:rFonts w:ascii="Times New Roman" w:hAnsi="Times New Roman" w:cs="Times New Roman"/>
+          <w:highlight w:val="green"/>
+        </w:rPr>
+        <w:t>Outstanding questions</w:t>
+      </w:r>
+    </w:p>
+    <w:p>
+      <w:pPr>
+        <w:spacing w:after="0" w:line="240" w:lineRule="auto"/>
+        <w:rPr>
+          <w:rFonts w:ascii="Times New Roman" w:hAnsi="Times New Roman" w:cs="Times New Roman"/>
+        </w:rPr>
+      </w:pPr>
+      <w:r>
+        <w:rPr>
+          <w:rFonts w:ascii="Times New Roman" w:hAnsi="Times New Roman" w:cs="Times New Roman"/>
+          <w:highlight w:val="magenta"/>
+        </w:rPr>
+        <w:t>Future reading</w:t>
+      </w:r>
+    </w:p>
+    <w:p>
+      <w:pPr>
+        <w:spacing w:after="0" w:line="240" w:lineRule="auto"/>
+        <w:rPr>
+          <w:rFonts w:ascii="Times New Roman" w:hAnsi="Times New Roman" w:cs="Times New Roman"/>
+        </w:rPr>
+      </w:pPr>
+      <w:r>
+        <w:rPr>
+          <w:rFonts w:ascii="Times New Roman" w:hAnsi="Times New Roman" w:cs="Times New Roman"/>
+          <w:highlight w:val="lightGray"/>
+        </w:rPr>
+        <w:t>Read already</w:t>
+      </w:r>
+      <w:r>
+        <w:rPr>
+          <w:rFonts w:ascii="Times New Roman" w:hAnsi="Times New Roman" w:cs="Times New Roman"/>
+        </w:rPr>
+        <w:t xml:space="preserve"> (w/ link) </w:t>
+      </w:r>
+    </w:p>
+    <w:p>
+      <w:pPr>
+        <w:spacing w:after="0" w:line="240" w:lineRule="auto"/>
+        <w:rPr>
+          <w:rFonts w:ascii="Times New Roman" w:hAnsi="Times New Roman" w:cs="Times New Roman"/>
+        </w:rPr>
+      </w:pPr>
+      <w:r>
+        <w:rPr>
+          <w:rFonts w:ascii="Times New Roman" w:hAnsi="Times New Roman" w:cs="Times New Roman"/>
+          <w:highlight w:val="cyan"/>
+        </w:rPr>
+        <w:t>To-do</w:t>
+      </w:r>
+    </w:p>
+    <w:p>
+      <w:pPr>
+        <w:spacing w:after="0" w:line="240" w:lineRule="auto"/>
+        <w:rPr>
+          <w:rFonts w:ascii="Times New Roman" w:hAnsi="Times New Roman" w:cs="Times New Roman"/>
+        </w:rPr>
+      </w:pPr>
+    </w:p>
+    <w:p>
+      <w:pPr>
+        <w:spacing w:after="0" w:line="240" w:lineRule="auto"/>
+        <w:rPr>
+          <w:rFonts w:ascii="Times New Roman" w:hAnsi="Times New Roman" w:cs="Times New Roman"/>
+        </w:rPr>
+      </w:pPr>
+    </w:p>
+    <w:p>
+      <w:pPr>
+        <w:spacing w:after="0" w:line="240" w:lineRule="auto"/>
+        <w:rPr>
+          <w:rFonts w:ascii="Times New Roman" w:hAnsi="Times New Roman" w:cs="Times New Roman"/>
+        </w:rPr>
+      </w:pPr>
+      <w:r>
+        <w:rPr>
+          <w:rFonts w:ascii="Times New Roman" w:hAnsi="Times New Roman" w:cs="Times New Roman"/>
+          <w:b/>
+          <w:bCs/>
+          <w:highlight w:val="cyan"/>
+        </w:rPr>
+        <w:t>Ahrens</w:t>
+      </w:r>
+      <w:r>
+        <w:rPr>
+          <w:rFonts w:ascii="Times New Roman" w:hAnsi="Times New Roman" w:cs="Times New Roman"/>
+          <w:b/>
+          <w:bCs/>
+        </w:rPr>
+        <w:t xml:space="preserve"> (2020)</w:t>
+      </w:r>
+      <w:r>
+        <w:rPr>
+          <w:rFonts w:ascii="Times New Roman" w:hAnsi="Times New Roman" w:cs="Times New Roman"/>
+        </w:rPr>
+        <w:t xml:space="preserve"> – </w:t>
+      </w:r>
+      <w:r>
+        <w:rPr>
+          <w:rFonts w:ascii="Times New Roman" w:hAnsi="Times New Roman" w:cs="Times New Roman"/>
+          <w:b/>
+          <w:bCs/>
+        </w:rPr>
+        <w:t>Commentary</w:t>
+      </w:r>
+    </w:p>
+    <w:p>
+      <w:pPr>
+        <w:spacing w:after="0" w:line="240" w:lineRule="auto"/>
+        <w:rPr>
+          <w:rFonts w:ascii="Times New Roman" w:hAnsi="Times New Roman" w:cs="Times New Roman"/>
+        </w:rPr>
+      </w:pPr>
+      <w:r>
+        <w:rPr>
+          <w:rFonts w:ascii="Times New Roman" w:hAnsi="Times New Roman" w:cs="Times New Roman"/>
+        </w:rPr>
+        <w:t>Intra-specific trait variation</w:t>
+      </w:r>
+      <w:r>
+        <w:rPr>
+          <w:rFonts w:ascii="Times New Roman" w:hAnsi="Times New Roman" w:cs="Times New Roman"/>
+        </w:rPr>
+        <w:t xml:space="preserve"> </w:t>
+      </w:r>
+      <w:r>
+        <w:rPr>
+          <w:rFonts w:ascii="Times New Roman" w:hAnsi="Times New Roman" w:cs="Times New Roman"/>
+        </w:rPr>
+        <w:t>remains hidden in the</w:t>
+      </w:r>
+      <w:r>
+        <w:rPr>
+          <w:rFonts w:ascii="Times New Roman" w:hAnsi="Times New Roman" w:cs="Times New Roman"/>
+        </w:rPr>
+        <w:t xml:space="preserve"> </w:t>
+      </w:r>
+      <w:r>
+        <w:rPr>
+          <w:rFonts w:ascii="Times New Roman" w:hAnsi="Times New Roman" w:cs="Times New Roman"/>
+        </w:rPr>
+        <w:t>environment</w:t>
+      </w:r>
+    </w:p>
+    <w:p>
+      <w:pPr>
+        <w:spacing w:after="0" w:line="240" w:lineRule="auto"/>
+        <w:rPr>
+          <w:rFonts w:ascii="Times New Roman" w:hAnsi="Times New Roman" w:cs="Times New Roman"/>
+        </w:rPr>
+      </w:pPr>
+      <w:r>
+        <w:rPr>
+          <w:rFonts w:ascii="Times New Roman" w:hAnsi="Times New Roman" w:cs="Times New Roman"/>
+          <w:i/>
+          <w:iCs/>
+        </w:rPr>
+        <w:t xml:space="preserve">New Phytologist, </w:t>
+      </w:r>
+      <w:r>
+        <w:rPr>
+          <w:rFonts w:ascii="Times New Roman" w:hAnsi="Times New Roman" w:cs="Times New Roman"/>
+          <w:i/>
+          <w:iCs/>
+        </w:rPr>
+        <w:t>229:1375-1387</w:t>
+      </w:r>
+    </w:p>
+    <w:p>
+      <w:pPr>
+        <w:spacing w:after="0" w:line="240" w:lineRule="auto"/>
+        <w:rPr>
+          <w:rFonts w:ascii="Times New Roman" w:hAnsi="Times New Roman" w:cs="Times New Roman"/>
+        </w:rPr>
+      </w:pPr>
+    </w:p>
+    <w:p>
+      <w:pPr>
+        <w:spacing w:after="0" w:line="240" w:lineRule="auto"/>
+        <w:rPr>
+          <w:rFonts w:ascii="Times New Roman" w:hAnsi="Times New Roman" w:cs="Times New Roman"/>
+          <w:b/>
+          <w:bCs/>
+        </w:rPr>
+      </w:pPr>
+      <w:r>
+        <w:rPr>
+          <w:rFonts w:ascii="Times New Roman" w:hAnsi="Times New Roman" w:cs="Times New Roman"/>
+          <w:b/>
+          <w:bCs/>
+        </w:rPr>
+        <w:t>Buckley (2004)</w:t>
+      </w:r>
+    </w:p>
+    <w:p>
+      <w:pPr>
+        <w:spacing w:after="0" w:line="240" w:lineRule="auto"/>
+        <w:rPr>
+          <w:rFonts w:ascii="Times New Roman" w:hAnsi="Times New Roman" w:cs="Times New Roman"/>
+        </w:rPr>
+      </w:pPr>
+      <w:r>
+        <w:rPr>
+          <w:rFonts w:ascii="Times New Roman" w:hAnsi="Times New Roman" w:cs="Times New Roman"/>
+        </w:rPr>
+        <w:t xml:space="preserve">Small-scale patterns in community structure of </w:t>
+      </w:r>
+      <w:r>
+        <w:rPr>
+          <w:rFonts w:ascii="Times New Roman" w:hAnsi="Times New Roman" w:cs="Times New Roman"/>
+          <w:i/>
+          <w:iCs/>
+        </w:rPr>
+        <w:t>Sarracenia purpurea</w:t>
+      </w:r>
+      <w:r>
+        <w:rPr>
+          <w:rFonts w:ascii="Times New Roman" w:hAnsi="Times New Roman" w:cs="Times New Roman"/>
+        </w:rPr>
+        <w:t xml:space="preserve"> inquilines</w:t>
+      </w:r>
+    </w:p>
+    <w:p>
+      <w:pPr>
+        <w:spacing w:after="0" w:line="240" w:lineRule="auto"/>
+        <w:rPr>
+          <w:rFonts w:ascii="Times New Roman" w:hAnsi="Times New Roman" w:cs="Times New Roman"/>
+        </w:rPr>
+      </w:pPr>
+      <w:r>
+        <w:rPr>
+          <w:rFonts w:ascii="Times New Roman" w:hAnsi="Times New Roman" w:cs="Times New Roman"/>
+          <w:i/>
+          <w:iCs/>
+        </w:rPr>
+        <w:t>Community Ecology, 5(2): 181-188</w:t>
       </w:r>
     </w:p>
     <w:p>
@@ -1409,300 +2330,14 @@
         <w:rPr>
           <w:rFonts w:ascii="Times New Roman" w:hAnsi="Times New Roman" w:cs="Times New Roman"/>
         </w:rPr>
-        <w:t>Variation in reaction norms is distributed across spatial scales within natural populations is poorly understood</w:t>
-      </w:r>
-    </w:p>
-    <w:p>
-      <w:pPr>
-        <w:pStyle w:val="ListParagraph"/>
-        <w:numPr>
-          <w:ilvl w:val="0"/>
-          <w:numId w:val="13"/>
-        </w:numPr>
-        <w:spacing w:after="0" w:line="240" w:lineRule="auto"/>
-        <w:rPr>
-          <w:rFonts w:ascii="Times New Roman" w:hAnsi="Times New Roman" w:cs="Times New Roman"/>
-        </w:rPr>
-      </w:pPr>
-      <w:r>
-        <w:rPr>
-          <w:rFonts w:ascii="Times New Roman" w:hAnsi="Times New Roman" w:cs="Times New Roman"/>
-        </w:rPr>
-        <w:t>Study system!</w:t>
-      </w:r>
-    </w:p>
-    <w:p>
-      <w:pPr>
-        <w:spacing w:after="0" w:line="240" w:lineRule="auto"/>
-        <w:rPr>
-          <w:rFonts w:ascii="Times New Roman" w:hAnsi="Times New Roman" w:cs="Times New Roman"/>
-        </w:rPr>
-      </w:pPr>
-    </w:p>
-    <w:p>
-      <w:pPr>
-        <w:spacing w:after="0" w:line="240" w:lineRule="auto"/>
-        <w:rPr>
-          <w:rFonts w:ascii="Times New Roman" w:hAnsi="Times New Roman" w:cs="Times New Roman"/>
-        </w:rPr>
-      </w:pPr>
-    </w:p>
-    <w:p>
-      <w:pPr>
-        <w:spacing w:after="0" w:line="240" w:lineRule="auto"/>
-        <w:rPr>
-          <w:rFonts w:ascii="Times New Roman" w:hAnsi="Times New Roman" w:cs="Times New Roman"/>
-        </w:rPr>
-      </w:pPr>
-    </w:p>
-    <w:p>
-      <w:pPr>
-        <w:spacing w:after="0" w:line="240" w:lineRule="auto"/>
-        <w:rPr>
-          <w:rFonts w:ascii="Times New Roman" w:hAnsi="Times New Roman" w:cs="Times New Roman"/>
-        </w:rPr>
-      </w:pPr>
-    </w:p>
-    <w:p>
-      <w:pPr>
-        <w:spacing w:after="0" w:line="480" w:lineRule="auto"/>
-        <w:rPr>
-          <w:rFonts w:ascii="Times New Roman" w:hAnsi="Times New Roman" w:cs="Times New Roman"/>
-        </w:rPr>
-      </w:pPr>
-    </w:p>
-    <w:p>
-      <w:pPr>
-        <w:rPr>
-          <w:rFonts w:ascii="Times New Roman" w:hAnsi="Times New Roman" w:cs="Times New Roman"/>
-        </w:rPr>
-      </w:pPr>
-      <w:r>
-        <w:rPr>
-          <w:rFonts w:ascii="Times New Roman" w:hAnsi="Times New Roman" w:cs="Times New Roman"/>
-        </w:rPr>
-        <w:br w:type="page"/>
-      </w:r>
-    </w:p>
-    <w:p>
-      <w:pPr>
-        <w:spacing w:after="0" w:line="480" w:lineRule="auto"/>
-        <w:rPr>
-          <w:rFonts w:ascii="Times New Roman" w:hAnsi="Times New Roman" w:cs="Times New Roman"/>
-        </w:rPr>
-      </w:pPr>
-      <w:r>
-        <w:rPr>
-          <w:rFonts w:ascii="Times New Roman" w:hAnsi="Times New Roman" w:cs="Times New Roman"/>
-        </w:rPr>
-        <w:lastRenderedPageBreak/>
-        <w:t>Readings</w:t>
-      </w:r>
-      <w:r>
-        <w:rPr>
-          <w:rFonts w:ascii="Times New Roman" w:hAnsi="Times New Roman" w:cs="Times New Roman"/>
-        </w:rPr>
-        <w:t>:</w:t>
-      </w:r>
-    </w:p>
-    <w:p>
-      <w:pPr>
-        <w:spacing w:after="0" w:line="240" w:lineRule="auto"/>
-        <w:rPr>
-          <w:rFonts w:ascii="Times New Roman" w:hAnsi="Times New Roman" w:cs="Times New Roman"/>
-        </w:rPr>
-      </w:pPr>
-      <w:r>
-        <w:rPr>
-          <w:rFonts w:ascii="Times New Roman" w:hAnsi="Times New Roman" w:cs="Times New Roman"/>
-          <w:highlight w:val="green"/>
-        </w:rPr>
-        <w:t>Outstanding questions</w:t>
-      </w:r>
-    </w:p>
-    <w:p>
-      <w:pPr>
-        <w:spacing w:after="0" w:line="240" w:lineRule="auto"/>
-        <w:rPr>
-          <w:rFonts w:ascii="Times New Roman" w:hAnsi="Times New Roman" w:cs="Times New Roman"/>
-        </w:rPr>
-      </w:pPr>
-      <w:r>
-        <w:rPr>
-          <w:rFonts w:ascii="Times New Roman" w:hAnsi="Times New Roman" w:cs="Times New Roman"/>
-          <w:highlight w:val="magenta"/>
-        </w:rPr>
-        <w:t>Future reading</w:t>
-      </w:r>
-    </w:p>
-    <w:p>
-      <w:pPr>
-        <w:spacing w:after="0" w:line="240" w:lineRule="auto"/>
-        <w:rPr>
-          <w:rFonts w:ascii="Times New Roman" w:hAnsi="Times New Roman" w:cs="Times New Roman"/>
-        </w:rPr>
-      </w:pPr>
-      <w:r>
-        <w:rPr>
-          <w:rFonts w:ascii="Times New Roman" w:hAnsi="Times New Roman" w:cs="Times New Roman"/>
-          <w:highlight w:val="lightGray"/>
-        </w:rPr>
-        <w:t>Read already</w:t>
-      </w:r>
-      <w:r>
-        <w:rPr>
-          <w:rFonts w:ascii="Times New Roman" w:hAnsi="Times New Roman" w:cs="Times New Roman"/>
-        </w:rPr>
-        <w:t xml:space="preserve"> (w/ link) </w:t>
-      </w:r>
-    </w:p>
-    <w:p>
-      <w:pPr>
-        <w:spacing w:after="0" w:line="240" w:lineRule="auto"/>
-        <w:rPr>
-          <w:rFonts w:ascii="Times New Roman" w:hAnsi="Times New Roman" w:cs="Times New Roman"/>
-        </w:rPr>
-      </w:pPr>
-      <w:r>
-        <w:rPr>
-          <w:rFonts w:ascii="Times New Roman" w:hAnsi="Times New Roman" w:cs="Times New Roman"/>
-          <w:highlight w:val="cyan"/>
-        </w:rPr>
-        <w:t>To-do</w:t>
-      </w:r>
-    </w:p>
-    <w:p>
-      <w:pPr>
-        <w:spacing w:after="0" w:line="240" w:lineRule="auto"/>
-        <w:rPr>
-          <w:rFonts w:ascii="Times New Roman" w:hAnsi="Times New Roman" w:cs="Times New Roman"/>
-        </w:rPr>
-      </w:pPr>
-    </w:p>
-    <w:p>
-      <w:pPr>
-        <w:spacing w:after="0" w:line="240" w:lineRule="auto"/>
-        <w:rPr>
-          <w:rFonts w:ascii="Times New Roman" w:hAnsi="Times New Roman" w:cs="Times New Roman"/>
-        </w:rPr>
-      </w:pPr>
-    </w:p>
-    <w:p>
-      <w:pPr>
-        <w:spacing w:after="0" w:line="240" w:lineRule="auto"/>
-        <w:rPr>
-          <w:rFonts w:ascii="Times New Roman" w:hAnsi="Times New Roman" w:cs="Times New Roman"/>
-        </w:rPr>
-      </w:pPr>
-      <w:r>
-        <w:rPr>
-          <w:rFonts w:ascii="Times New Roman" w:hAnsi="Times New Roman" w:cs="Times New Roman"/>
-          <w:b/>
-          <w:bCs/>
-          <w:highlight w:val="cyan"/>
-        </w:rPr>
-        <w:t>Ahrens</w:t>
-      </w:r>
-      <w:r>
-        <w:rPr>
-          <w:rFonts w:ascii="Times New Roman" w:hAnsi="Times New Roman" w:cs="Times New Roman"/>
-          <w:b/>
-          <w:bCs/>
-        </w:rPr>
-        <w:t xml:space="preserve"> (2020)</w:t>
-      </w:r>
-      <w:r>
-        <w:rPr>
-          <w:rFonts w:ascii="Times New Roman" w:hAnsi="Times New Roman" w:cs="Times New Roman"/>
-        </w:rPr>
-        <w:t xml:space="preserve"> – </w:t>
-      </w:r>
-      <w:r>
-        <w:rPr>
-          <w:rFonts w:ascii="Times New Roman" w:hAnsi="Times New Roman" w:cs="Times New Roman"/>
-          <w:b/>
-          <w:bCs/>
-        </w:rPr>
-        <w:t>Commentary</w:t>
-      </w:r>
-    </w:p>
-    <w:p>
-      <w:pPr>
-        <w:spacing w:after="0" w:line="240" w:lineRule="auto"/>
-        <w:rPr>
-          <w:rFonts w:ascii="Times New Roman" w:hAnsi="Times New Roman" w:cs="Times New Roman"/>
-        </w:rPr>
-      </w:pPr>
-      <w:r>
-        <w:rPr>
-          <w:rFonts w:ascii="Times New Roman" w:hAnsi="Times New Roman" w:cs="Times New Roman"/>
-        </w:rPr>
-        <w:t>Intra-specific trait variation</w:t>
-      </w:r>
-      <w:r>
-        <w:rPr>
-          <w:rFonts w:ascii="Times New Roman" w:hAnsi="Times New Roman" w:cs="Times New Roman"/>
-        </w:rPr>
-        <w:t xml:space="preserve"> </w:t>
-      </w:r>
-      <w:r>
-        <w:rPr>
-          <w:rFonts w:ascii="Times New Roman" w:hAnsi="Times New Roman" w:cs="Times New Roman"/>
-        </w:rPr>
-        <w:t>remains hidden in the</w:t>
-      </w:r>
-      <w:r>
-        <w:rPr>
-          <w:rFonts w:ascii="Times New Roman" w:hAnsi="Times New Roman" w:cs="Times New Roman"/>
-        </w:rPr>
-        <w:t xml:space="preserve"> </w:t>
-      </w:r>
-      <w:r>
-        <w:rPr>
-          <w:rFonts w:ascii="Times New Roman" w:hAnsi="Times New Roman" w:cs="Times New Roman"/>
-        </w:rPr>
-        <w:t>environment</w:t>
-      </w:r>
-    </w:p>
-    <w:p>
-      <w:pPr>
-        <w:spacing w:after="0" w:line="240" w:lineRule="auto"/>
-        <w:rPr>
-          <w:rFonts w:ascii="Times New Roman" w:hAnsi="Times New Roman" w:cs="Times New Roman"/>
-        </w:rPr>
-      </w:pPr>
-      <w:r>
-        <w:rPr>
-          <w:rFonts w:ascii="Times New Roman" w:hAnsi="Times New Roman" w:cs="Times New Roman"/>
-          <w:i/>
-          <w:iCs/>
-        </w:rPr>
-        <w:t xml:space="preserve">New Phytologist, </w:t>
-      </w:r>
-      <w:r>
-        <w:rPr>
-          <w:rFonts w:ascii="Times New Roman" w:hAnsi="Times New Roman" w:cs="Times New Roman"/>
-          <w:i/>
-          <w:iCs/>
-        </w:rPr>
-        <w:t>229:1375-1387</w:t>
-      </w:r>
-    </w:p>
-    <w:p>
-      <w:pPr>
-        <w:spacing w:after="0" w:line="240" w:lineRule="auto"/>
-        <w:rPr>
-          <w:rFonts w:ascii="Times New Roman" w:hAnsi="Times New Roman" w:cs="Times New Roman"/>
-        </w:rPr>
-      </w:pPr>
-    </w:p>
-    <w:p>
-      <w:pPr>
-        <w:spacing w:after="0" w:line="240" w:lineRule="auto"/>
-        <w:rPr>
-          <w:rFonts w:ascii="Times New Roman" w:hAnsi="Times New Roman" w:cs="Times New Roman"/>
-        </w:rPr>
-      </w:pPr>
+        <w:t>Talks about rotifer and protist abundances and co-</w:t>
+      </w:r>
+      <w:r>
+        <w:rPr>
+          <w:rFonts w:ascii="Times New Roman" w:hAnsi="Times New Roman" w:cs="Times New Roman"/>
+        </w:rPr>
+        <w:t>occurrences</w:t>
+      </w:r>
     </w:p>
     <w:p>
       <w:pPr>
@@ -2112,21 +2747,7 @@
         <w:rPr>
           <w:rFonts w:ascii="Times New Roman" w:hAnsi="Times New Roman" w:cs="Times New Roman"/>
         </w:rPr>
-        <w:t xml:space="preserve"> a </w:t>
-      </w:r>
-      <w:proofErr w:type="gramStart"/>
-      <w:r>
-        <w:rPr>
-          <w:rFonts w:ascii="Times New Roman" w:hAnsi="Times New Roman" w:cs="Times New Roman"/>
-        </w:rPr>
-        <w:t>bit,</w:t>
-      </w:r>
-      <w:proofErr w:type="gramEnd"/>
-      <w:r>
-        <w:rPr>
-          <w:rFonts w:ascii="Times New Roman" w:hAnsi="Times New Roman" w:cs="Times New Roman"/>
-        </w:rPr>
-        <w:t xml:space="preserve"> might be useful; also see above. Search term: critical thermal maximum</w:t>
+        <w:t xml:space="preserve"> a bit, might be useful; also see above. Search term: critical thermal maximum</w:t>
       </w:r>
     </w:p>
     <w:p>
@@ -2145,6 +2766,7 @@
         <w:rPr>
           <w:rFonts w:ascii="Times New Roman" w:hAnsi="Times New Roman" w:cs="Times New Roman"/>
         </w:rPr>
+        <w:lastRenderedPageBreak/>
         <w:t>Trait changes under constant and fluctuating temperatures…</w:t>
       </w:r>
     </w:p>
@@ -2477,21 +3099,7 @@
         <w:rPr>
           <w:rFonts w:ascii="Times New Roman" w:hAnsi="Times New Roman" w:cs="Times New Roman"/>
         </w:rPr>
-        <w:t xml:space="preserve">Adaptive phenotypic plasticity and resilience of vertebrates to </w:t>
-      </w:r>
-      <w:proofErr w:type="gramStart"/>
-      <w:r>
-        <w:rPr>
-          <w:rFonts w:ascii="Times New Roman" w:hAnsi="Times New Roman" w:cs="Times New Roman"/>
-        </w:rPr>
-        <w:t>increasing</w:t>
-      </w:r>
-      <w:proofErr w:type="gramEnd"/>
-      <w:r>
-        <w:rPr>
-          <w:rFonts w:ascii="Times New Roman" w:hAnsi="Times New Roman" w:cs="Times New Roman"/>
-        </w:rPr>
-        <w:t xml:space="preserve"> climatic unpredictability</w:t>
+        <w:t>Adaptive phenotypic plasticity and resilience of vertebrates to increasing climatic unpredictability</w:t>
       </w:r>
       <w:r>
         <w:rPr>
@@ -2944,21 +3552,7 @@
         <w:rPr>
           <w:rFonts w:ascii="Times New Roman" w:hAnsi="Times New Roman" w:cs="Times New Roman"/>
         </w:rPr>
-        <w:t xml:space="preserve">Thompson, J.N. 1998. Rapid evolution </w:t>
-      </w:r>
-      <w:proofErr w:type="gramStart"/>
-      <w:r>
-        <w:rPr>
-          <w:rFonts w:ascii="Times New Roman" w:hAnsi="Times New Roman" w:cs="Times New Roman"/>
-        </w:rPr>
-        <w:t>as</w:t>
-      </w:r>
-      <w:proofErr w:type="gramEnd"/>
-      <w:r>
-        <w:rPr>
-          <w:rFonts w:ascii="Times New Roman" w:hAnsi="Times New Roman" w:cs="Times New Roman"/>
-        </w:rPr>
-        <w:t xml:space="preserve"> an ecological process. </w:t>
+        <w:t xml:space="preserve">Thompson, J.N. 1998. Rapid evolution as an ecological process. </w:t>
       </w:r>
       <w:proofErr w:type="spellStart"/>
       <w:r>
@@ -3019,21 +3613,7 @@
         <w:rPr>
           <w:rFonts w:ascii="Times New Roman" w:hAnsi="Times New Roman" w:cs="Times New Roman"/>
         </w:rPr>
-        <w:t xml:space="preserve">Hairston, N.G. 2005. Rapid evolution and the convergence of ecological and evolutionary </w:t>
-      </w:r>
-      <w:proofErr w:type="gramStart"/>
-      <w:r>
-        <w:rPr>
-          <w:rFonts w:ascii="Times New Roman" w:hAnsi="Times New Roman" w:cs="Times New Roman"/>
-        </w:rPr>
-        <w:t>time</w:t>
-      </w:r>
-      <w:proofErr w:type="gramEnd"/>
-      <w:r>
-        <w:rPr>
-          <w:rFonts w:ascii="Times New Roman" w:hAnsi="Times New Roman" w:cs="Times New Roman"/>
-        </w:rPr>
-        <w:t xml:space="preserve">. </w:t>
+        <w:t xml:space="preserve">Hairston, N.G. 2005. Rapid evolution and the convergence of ecological and evolutionary time. </w:t>
       </w:r>
       <w:proofErr w:type="spellStart"/>
       <w:r>
@@ -3115,6 +3695,7 @@
         <w:rPr>
           <w:rFonts w:ascii="Times New Roman" w:hAnsi="Times New Roman" w:cs="Times New Roman"/>
         </w:rPr>
+        <w:lastRenderedPageBreak/>
         <w:t xml:space="preserve">Kinnison, M.T. 2007. Eco-evolutionary conservation biology: contemporary evolution and the dynamics of persistence. </w:t>
       </w:r>
       <w:r>
@@ -3148,7 +3729,6 @@
         <w:rPr>
           <w:rFonts w:ascii="Times New Roman" w:hAnsi="Times New Roman" w:cs="Times New Roman"/>
         </w:rPr>
-        <w:lastRenderedPageBreak/>
         <w:t xml:space="preserve">Pelletier, F. 2009. Eco-evolutionary dynamics. </w:t>
       </w:r>
       <w:proofErr w:type="spellStart"/>
@@ -3402,21 +3982,7 @@
         <w:rPr>
           <w:rFonts w:ascii="Times New Roman" w:hAnsi="Times New Roman" w:cs="Times New Roman"/>
         </w:rPr>
-        <w:t xml:space="preserve">: look at reaction norms of 17 clones at 2 temps independent of the spatial distribution of the </w:t>
-      </w:r>
-      <w:proofErr w:type="gramStart"/>
-      <w:r>
-        <w:rPr>
-          <w:rFonts w:ascii="Times New Roman" w:hAnsi="Times New Roman" w:cs="Times New Roman"/>
-        </w:rPr>
-        <w:t>origin</w:t>
-      </w:r>
-      <w:proofErr w:type="gramEnd"/>
-      <w:r>
-        <w:rPr>
-          <w:rFonts w:ascii="Times New Roman" w:hAnsi="Times New Roman" w:cs="Times New Roman"/>
-        </w:rPr>
-        <w:t xml:space="preserve"> leaf water samples?</w:t>
+        <w:t>: look at reaction norms of 17 clones at 2 temps independent of the spatial distribution of the origin leaf water samples?</w:t>
       </w:r>
     </w:p>
     <w:p>
@@ -3812,23 +4378,7 @@
           <w:rFonts w:ascii="Times New Roman" w:hAnsi="Times New Roman" w:cs="Times New Roman"/>
           <w:highlight w:val="magenta"/>
         </w:rPr>
-        <w:t xml:space="preserve">Ellner S.P. 2011. Does rapid evolution matter? Measuring the rate of contemporary evolution and its </w:t>
-      </w:r>
-      <w:proofErr w:type="gramStart"/>
-      <w:r>
-        <w:rPr>
-          <w:rFonts w:ascii="Times New Roman" w:hAnsi="Times New Roman" w:cs="Times New Roman"/>
-          <w:highlight w:val="magenta"/>
-        </w:rPr>
-        <w:t>impacts</w:t>
-      </w:r>
-      <w:proofErr w:type="gramEnd"/>
-      <w:r>
-        <w:rPr>
-          <w:rFonts w:ascii="Times New Roman" w:hAnsi="Times New Roman" w:cs="Times New Roman"/>
-          <w:highlight w:val="magenta"/>
-        </w:rPr>
-        <w:t xml:space="preserve"> on ecological dynamics</w:t>
+        <w:t>Ellner S.P. 2011. Does rapid evolution matter? Measuring the rate of contemporary evolution and its impacts on ecological dynamics</w:t>
       </w:r>
       <w:r>
         <w:rPr>
@@ -3954,21 +4504,7 @@
         <w:rPr>
           <w:rFonts w:ascii="Times New Roman" w:hAnsi="Times New Roman" w:cs="Times New Roman"/>
         </w:rPr>
-        <w:t xml:space="preserve">Evolutionary responses to global change </w:t>
-      </w:r>
-      <w:proofErr w:type="gramStart"/>
-      <w:r>
-        <w:rPr>
-          <w:rFonts w:ascii="Times New Roman" w:hAnsi="Times New Roman" w:cs="Times New Roman"/>
-        </w:rPr>
-        <w:t>in species-</w:t>
-      </w:r>
-      <w:proofErr w:type="gramEnd"/>
-      <w:r>
-        <w:rPr>
-          <w:rFonts w:ascii="Times New Roman" w:hAnsi="Times New Roman" w:cs="Times New Roman"/>
-        </w:rPr>
-        <w:t>rich communities</w:t>
+        <w:t>Evolutionary responses to global change in species-rich communities</w:t>
       </w:r>
     </w:p>
     <w:p>
@@ -4003,7 +4539,6 @@
           <w:b/>
           <w:bCs/>
         </w:rPr>
-        <w:lastRenderedPageBreak/>
         <w:t>Miner</w:t>
       </w:r>
       <w:r>
@@ -4357,21 +4892,7 @@
         <w:rPr>
           <w:rFonts w:ascii="Times New Roman" w:hAnsi="Times New Roman" w:cs="Times New Roman"/>
         </w:rPr>
-        <w:t xml:space="preserve">Fluctuating temperature did not affect mean responses in any of the traits </w:t>
-      </w:r>
-      <w:proofErr w:type="gramStart"/>
-      <w:r>
-        <w:rPr>
-          <w:rFonts w:ascii="Times New Roman" w:hAnsi="Times New Roman" w:cs="Times New Roman"/>
-        </w:rPr>
-        <w:t>measured by</w:t>
-      </w:r>
-      <w:proofErr w:type="gramEnd"/>
-      <w:r>
-        <w:rPr>
-          <w:rFonts w:ascii="Times New Roman" w:hAnsi="Times New Roman" w:cs="Times New Roman"/>
-        </w:rPr>
-        <w:t xml:space="preserve"> very much (usually </w:t>
+        <w:t xml:space="preserve">Fluctuating temperature did not affect mean responses in any of the traits measured by very much (usually </w:t>
       </w:r>
       <w:proofErr w:type="spellStart"/>
       <w:r>
@@ -4418,21 +4939,7 @@
         <w:rPr>
           <w:rFonts w:ascii="Times New Roman" w:hAnsi="Times New Roman" w:cs="Times New Roman"/>
         </w:rPr>
-        <w:t xml:space="preserve">Constant </w:t>
-      </w:r>
-      <w:proofErr w:type="gramStart"/>
-      <w:r>
-        <w:rPr>
-          <w:rFonts w:ascii="Times New Roman" w:hAnsi="Times New Roman" w:cs="Times New Roman"/>
-        </w:rPr>
-        <w:t>temperature</w:t>
-      </w:r>
-      <w:proofErr w:type="gramEnd"/>
-      <w:r>
-        <w:rPr>
-          <w:rFonts w:ascii="Times New Roman" w:hAnsi="Times New Roman" w:cs="Times New Roman"/>
-        </w:rPr>
-        <w:t xml:space="preserve"> had more variance than fluctuating temperature</w:t>
+        <w:t>Constant temperature had more variance than fluctuating temperature</w:t>
       </w:r>
     </w:p>
     <w:p>
@@ -6413,7 +6920,6 @@
         <w:t xml:space="preserve"> logistic growth equation was fit to population growth data using the package </w:t>
       </w:r>
       <w:proofErr w:type="spellStart"/>
-      <w:proofErr w:type="gramStart"/>
       <w:r>
         <w:rPr>
           <w:rFonts w:ascii="Times New Roman" w:hAnsi="Times New Roman" w:cs="Times New Roman"/>
@@ -6421,7 +6927,6 @@
         <w:t>growthrates</w:t>
       </w:r>
       <w:proofErr w:type="spellEnd"/>
-      <w:proofErr w:type="gramEnd"/>
       <w:r>
         <w:rPr>
           <w:rFonts w:ascii="Times New Roman" w:hAnsi="Times New Roman" w:cs="Times New Roman"/>
@@ -6670,7 +7175,6 @@
         <w:t xml:space="preserve">This formulation was implemented as a user-specified growth model within </w:t>
       </w:r>
       <w:proofErr w:type="spellStart"/>
-      <w:proofErr w:type="gramStart"/>
       <w:r>
         <w:rPr>
           <w:rFonts w:ascii="Times New Roman" w:hAnsi="Times New Roman" w:cs="Times New Roman"/>
@@ -6678,7 +7182,6 @@
         <w:t>growthrates</w:t>
       </w:r>
       <w:proofErr w:type="spellEnd"/>
-      <w:proofErr w:type="gramEnd"/>
       <w:r>
         <w:rPr>
           <w:rFonts w:ascii="Times New Roman" w:hAnsi="Times New Roman" w:cs="Times New Roman"/>
@@ -7229,28 +7732,14 @@
         <w:rPr>
           <w:rFonts w:ascii="Times New Roman" w:hAnsi="Times New Roman" w:cs="Times New Roman"/>
         </w:rPr>
-        <w:t>fit_</w:t>
-      </w:r>
-      <w:proofErr w:type="gramStart"/>
-      <w:r>
-        <w:rPr>
-          <w:rFonts w:ascii="Times New Roman" w:hAnsi="Times New Roman" w:cs="Times New Roman"/>
-        </w:rPr>
-        <w:t>spline</w:t>
+        <w:t>fit_spline</w:t>
       </w:r>
       <w:proofErr w:type="spellEnd"/>
       <w:r>
         <w:rPr>
           <w:rFonts w:ascii="Times New Roman" w:hAnsi="Times New Roman" w:cs="Times New Roman"/>
         </w:rPr>
-        <w:t>(</w:t>
-      </w:r>
-      <w:proofErr w:type="gramEnd"/>
-      <w:r>
-        <w:rPr>
-          <w:rFonts w:ascii="Times New Roman" w:hAnsi="Times New Roman" w:cs="Times New Roman"/>
-        </w:rPr>
-        <w:t xml:space="preserve">) function in the </w:t>
+        <w:t xml:space="preserve">() function in the </w:t>
       </w:r>
       <w:proofErr w:type="spellStart"/>
       <w:r>
@@ -8253,23 +8742,7 @@
           <w:rFonts w:ascii="Times New Roman" w:hAnsi="Times New Roman" w:cs="Times New Roman"/>
           <w:highlight w:val="green"/>
         </w:rPr>
-        <w:t xml:space="preserve"> (</w:t>
-      </w:r>
-      <w:proofErr w:type="gramStart"/>
-      <w:r>
-        <w:rPr>
-          <w:rFonts w:ascii="Times New Roman" w:hAnsi="Times New Roman" w:cs="Times New Roman"/>
-          <w:highlight w:val="green"/>
-        </w:rPr>
-        <w:t>Tetra..</w:t>
-      </w:r>
-      <w:proofErr w:type="gramEnd"/>
-      <w:r>
-        <w:rPr>
-          <w:rFonts w:ascii="Times New Roman" w:hAnsi="Times New Roman" w:cs="Times New Roman"/>
-          <w:highlight w:val="green"/>
-        </w:rPr>
-        <w:t>)</w:t>
+        <w:t xml:space="preserve"> (Tetra..)</w:t>
       </w:r>
       <w:r>
         <w:rPr>
@@ -10284,19 +10757,11 @@
         </w:rPr>
         <w:t xml:space="preserve"> </w:t>
       </w:r>
-      <w:proofErr w:type="gramStart"/>
-      <w:r>
-        <w:rPr>
-          <w:rFonts w:ascii="Times New Roman" w:hAnsi="Times New Roman" w:cs="Times New Roman"/>
-        </w:rPr>
-        <w:t>acting</w:t>
-      </w:r>
-      <w:proofErr w:type="gramEnd"/>
-      <w:r>
-        <w:rPr>
-          <w:rFonts w:ascii="Times New Roman" w:hAnsi="Times New Roman" w:cs="Times New Roman"/>
-        </w:rPr>
-        <w:t xml:space="preserve"> as</w:t>
+      <w:r>
+        <w:rPr>
+          <w:rFonts w:ascii="Times New Roman" w:hAnsi="Times New Roman" w:cs="Times New Roman"/>
+        </w:rPr>
+        <w:t>acting as</w:t>
       </w:r>
       <w:r>
         <w:rPr>
@@ -10939,6 +11404,43 @@
           <w:rFonts w:ascii="Times New Roman" w:hAnsi="Times New Roman" w:cs="Times New Roman"/>
         </w:rPr>
         <w:t>.</w:t>
+      </w:r>
+    </w:p>
+    <w:p>
+      <w:pPr>
+        <w:spacing w:after="0" w:line="480" w:lineRule="auto"/>
+        <w:rPr>
+          <w:rFonts w:ascii="Times New Roman" w:hAnsi="Times New Roman" w:cs="Times New Roman"/>
+        </w:rPr>
+      </w:pPr>
+    </w:p>
+    <w:p>
+      <w:pPr>
+        <w:spacing w:after="0" w:line="480" w:lineRule="auto"/>
+        <w:rPr>
+          <w:rFonts w:ascii="Times New Roman" w:hAnsi="Times New Roman" w:cs="Times New Roman"/>
+        </w:rPr>
+      </w:pPr>
+    </w:p>
+    <w:p>
+      <w:pPr>
+        <w:spacing w:after="0" w:line="480" w:lineRule="auto"/>
+        <w:rPr>
+          <w:rFonts w:ascii="Times New Roman" w:hAnsi="Times New Roman" w:cs="Times New Roman"/>
+        </w:rPr>
+      </w:pPr>
+      <w:r>
+        <w:rPr>
+          <w:rFonts w:ascii="Times New Roman" w:hAnsi="Times New Roman" w:cs="Times New Roman"/>
+        </w:rPr>
+        <w:t>For public-scale data obtained through NatureServe Explorer:</w:t>
+      </w:r>
+      <w:r>
+        <w:rPr>
+          <w:rFonts w:ascii="Times New Roman" w:hAnsi="Times New Roman" w:cs="Times New Roman"/>
+        </w:rPr>
+        <w:br/>
+        <w:t>NatureServe. YYYY. NatureServe Explorer [web application]. NatureServe, Arlington, Virginia. Available https://explorer.natureserve.org/pro/. (Accessed: Month DD, YYYY).</w:t>
       </w:r>
     </w:p>
     <w:sectPr>
@@ -13290,7 +13792,6 @@
   <w:style w:type="character" w:default="1" w:styleId="DefaultParagraphFont">
     <w:name w:val="Default Paragraph Font"/>
     <w:uiPriority w:val="1"/>
-    <w:semiHidden/>
     <w:unhideWhenUsed/>
   </w:style>
   <w:style w:type="table" w:default="1" w:styleId="TableNormal">

</xml_diff>